<commit_message>
created records page and fixed page links
</commit_message>
<xml_diff>
--- a/reports_output/parts_supplies_1_2026.docx
+++ b/reports_output/parts_supplies_1_2026.docx
@@ -41,7 +41,7 @@
         </w:rPr>
       </w:pPr>
       <w:r>
-        <w:t>Date &amp; Time Generated: 2026-01-09 20:29:56</w:t>
+        <w:t>Date &amp; Time Generated: 2026-01-10 04:02:36</w:t>
       </w:r>
     </w:p>
     <w:p>
@@ -466,6 +466,58 @@
           </w:tcPr>
           <w:p>
             <w:r>
+              <w:t>Karolle Dane Ona</w:t>
+            </w:r>
+          </w:p>
+        </w:tc>
+        <w:tc>
+          <w:tcPr>
+            <w:tcW w:type="dxa" w:w="1627"/>
+          </w:tcPr>
+          <w:p>
+            <w:r>
+              <w:t>Ignition</w:t>
+            </w:r>
+          </w:p>
+        </w:tc>
+        <w:tc>
+          <w:tcPr>
+            <w:tcW w:type="dxa" w:w="2342"/>
+          </w:tcPr>
+          <w:p>
+            <w:r>
+              <w:t>3</w:t>
+            </w:r>
+          </w:p>
+        </w:tc>
+        <w:tc>
+          <w:tcPr>
+            <w:tcW w:type="dxa" w:w="1402"/>
+          </w:tcPr>
+          <w:p>
+            <w:r>
+              <w:t>Pieces</w:t>
+            </w:r>
+          </w:p>
+        </w:tc>
+        <w:tc>
+          <w:tcPr>
+            <w:tcW w:type="dxa" w:w="1402"/>
+          </w:tcPr>
+          <w:p>
+            <w:r>
+              <w:t>Low Stock</w:t>
+            </w:r>
+          </w:p>
+        </w:tc>
+      </w:tr>
+      <w:tr>
+        <w:tc>
+          <w:tcPr>
+            <w:tcW w:type="dxa" w:w="2117"/>
+          </w:tcPr>
+          <w:p>
+            <w:r>
               <w:t>Snoopy</w:t>
             </w:r>
           </w:p>
@@ -709,7 +761,7 @@
         </w:rPr>
       </w:pPr>
       <w:r>
-        <w:t>Total Parts and Supplies Items: 5</w:t>
+        <w:t>Total Parts and Supplies Items: 6</w:t>
       </w:r>
     </w:p>
     <w:p>
@@ -789,7 +841,7 @@
         </w:rPr>
       </w:pPr>
       <w:r>
-        <w:t>Total Low Stock Items: 2</w:t>
+        <w:t>Total Low Stock Items: 3</w:t>
       </w:r>
     </w:p>
     <w:p>

</xml_diff>